<commit_message>
Ajuste no conteúdo inicio-TCC
</commit_message>
<xml_diff>
--- a/AD5933/AD5933-projects/docs-TCC/inicio - TCC  - Pablo Mattos.docx
+++ b/AD5933/AD5933-projects/docs-TCC/inicio - TCC  - Pablo Mattos.docx
@@ -140,25 +140,74 @@
         <w:jc w:val="both"/>
       </w:pPr>
       <w:r>
-        <w:t xml:space="preserve">O projeto </w:t>
-      </w:r>
-      <w:r>
         <w:rPr>
-          <w:i/>
-          <w:iCs/>
+          <w:b/>
+          <w:bCs/>
         </w:rPr>
-        <w:t>AD5933-based spectrometer for electrical bioimpedance applications</w:t>
-      </w:r>
-      <w:r>
-        <w:t xml:space="preserve"> tem como objetivo o desenvolvimento de um espectrômetro de bioimpedância elétrica voltado a aplicações biomédicas, incluindo monitoramento fisiológico e dispositivos vestíveis. O sistema realiza medições de impedância em tecidos biológicos utilizando modelos equivalentes do tipo 2R1C, com varredura em frequência e análise dos parâmetros resistivos e capacitivos.</w:t>
-      </w:r>
-    </w:p>
-    <w:p>
-      <w:pPr>
-        <w:jc w:val="both"/>
-      </w:pPr>
-      <w:r>
-        <w:t>Os principais parâmetros utilizados foram:</w:t>
+        <w:t xml:space="preserve">2.1 Projeto AD5933-based </w:t>
+      </w:r>
+      <w:proofErr w:type="spellStart"/>
+      <w:r>
+        <w:rPr>
+          <w:b/>
+          <w:bCs/>
+        </w:rPr>
+        <w:t>spectrometer</w:t>
+      </w:r>
+      <w:proofErr w:type="spellEnd"/>
+      <w:r>
+        <w:rPr>
+          <w:b/>
+          <w:bCs/>
+        </w:rPr>
+        <w:t xml:space="preserve"> for </w:t>
+      </w:r>
+      <w:proofErr w:type="spellStart"/>
+      <w:r>
+        <w:rPr>
+          <w:b/>
+          <w:bCs/>
+        </w:rPr>
+        <w:t>electrical</w:t>
+      </w:r>
+      <w:proofErr w:type="spellEnd"/>
+      <w:r>
+        <w:rPr>
+          <w:b/>
+          <w:bCs/>
+        </w:rPr>
+        <w:t xml:space="preserve"> </w:t>
+      </w:r>
+      <w:proofErr w:type="spellStart"/>
+      <w:r>
+        <w:rPr>
+          <w:b/>
+          <w:bCs/>
+        </w:rPr>
+        <w:t>bioimpedance</w:t>
+      </w:r>
+      <w:proofErr w:type="spellEnd"/>
+    </w:p>
+    <w:p>
+      <w:pPr>
+        <w:jc w:val="both"/>
+      </w:pPr>
+      <w:r>
+        <w:t>Este projeto tem como objetivo o desenvolvimento de um espectrômetro de bioimpedância elétrica voltado a aplicações biomédicas, incluindo monitoramento fisiológico e dispositivos vestíveis. O sistema realiza medições de impedância em tecidos biológicos utilizando modelos equivalentes do tipo 2R1C, com varredura em frequência e análise dos parâmetros resistivos e capacitivos.</w:t>
+      </w:r>
+    </w:p>
+    <w:p>
+      <w:pPr>
+        <w:jc w:val="both"/>
+      </w:pPr>
+      <w:r>
+        <w:t>P</w:t>
+      </w:r>
+      <w:r>
+        <w:t>rincipais parâmetros</w:t>
+      </w:r>
+      <w:r>
+        <w:t>:</w:t>
       </w:r>
     </w:p>
     <w:p>
@@ -261,7 +310,11 @@
         <w:jc w:val="both"/>
       </w:pPr>
       <w:r>
-        <w:t>Os parâmetros principais incluem:</w:t>
+        <w:rPr>
+          <w:b/>
+          <w:bCs/>
+        </w:rPr>
+        <w:t>Principais parâmetros:</w:t>
       </w:r>
     </w:p>
     <w:p>
@@ -360,7 +413,11 @@
         <w:jc w:val="both"/>
       </w:pPr>
       <w:r>
-        <w:t>Os parâmetros considerados incluem:</w:t>
+        <w:rPr>
+          <w:b/>
+          <w:bCs/>
+        </w:rPr>
+        <w:t>Principais parâmetros:</w:t>
       </w:r>
     </w:p>
     <w:p>
@@ -484,7 +541,11 @@
         <w:jc w:val="both"/>
       </w:pPr>
       <w:r>
-        <w:t>Os principais parâmetros incluem:</w:t>
+        <w:rPr>
+          <w:b/>
+          <w:bCs/>
+        </w:rPr>
+        <w:t>Principais parâmetros:</w:t>
       </w:r>
     </w:p>
     <w:p>
@@ -496,7 +557,13 @@
         <w:jc w:val="both"/>
       </w:pPr>
       <w:r>
-        <w:t xml:space="preserve">Faixa de impedância: 100 Ω a MΩ </w:t>
+        <w:t xml:space="preserve">Faixa de impedância: 100 Ω a </w:t>
+      </w:r>
+      <w:r>
+        <w:t>1</w:t>
+      </w:r>
+      <w:r>
+        <w:t xml:space="preserve">MΩ </w:t>
       </w:r>
     </w:p>
     <w:p>
@@ -583,7 +650,11 @@
         <w:jc w:val="both"/>
       </w:pPr>
       <w:r>
-        <w:t>Os parâmetros incluem:</w:t>
+        <w:rPr>
+          <w:b/>
+          <w:bCs/>
+        </w:rPr>
+        <w:t>Principais parâmetros:</w:t>
       </w:r>
     </w:p>
     <w:p>
@@ -595,7 +666,21 @@
         <w:jc w:val="both"/>
       </w:pPr>
       <w:r>
-        <w:t xml:space="preserve">Sistema multicanal </w:t>
+        <w:rPr>
+          <w:b/>
+          <w:bCs/>
+        </w:rPr>
+        <w:t>Sistema</w:t>
+      </w:r>
+      <w:r>
+        <w:rPr>
+          <w:b/>
+          <w:bCs/>
+        </w:rPr>
+        <w:t>:</w:t>
+      </w:r>
+      <w:r>
+        <w:t xml:space="preserve"> multicanal </w:t>
       </w:r>
     </w:p>
     <w:p>
@@ -607,27 +692,28 @@
         <w:jc w:val="both"/>
       </w:pPr>
       <w:r>
+        <w:rPr>
+          <w:b/>
+          <w:bCs/>
+        </w:rPr>
+        <w:t>Operação:</w:t>
+      </w:r>
+      <w:r>
+        <w:t xml:space="preserve"> </w:t>
+      </w:r>
+      <w:r>
         <w:t xml:space="preserve">Varredura em frequência </w:t>
       </w:r>
-    </w:p>
-    <w:p>
-      <w:pPr>
-        <w:numPr>
-          <w:ilvl w:val="0"/>
-          <w:numId w:val="17"/>
-        </w:numPr>
+      <w:r>
+        <w:t>e matrizes de impedância</w:t>
+      </w:r>
+    </w:p>
+    <w:p>
+      <w:pPr>
         <w:jc w:val="both"/>
       </w:pPr>
       <w:r>
         <w:lastRenderedPageBreak/>
-        <w:t xml:space="preserve">Matrizes de impedância </w:t>
-      </w:r>
-    </w:p>
-    <w:p>
-      <w:pPr>
-        <w:jc w:val="both"/>
-      </w:pPr>
-      <w:r>
         <w:t>As limitações do AD5933 nesse contexto incluem a capacidade de medir apenas um canal por vez, baixa velocidade para aplicações multicanais e sensibilidade a ruídos.</w:t>
       </w:r>
     </w:p>
@@ -4132,7 +4218,6 @@
   <w:style w:type="character" w:default="1" w:styleId="Fontepargpadro">
     <w:name w:val="Default Paragraph Font"/>
     <w:uiPriority w:val="1"/>
-    <w:semiHidden/>
     <w:unhideWhenUsed/>
   </w:style>
   <w:style w:type="table" w:default="1" w:styleId="Tabelanormal">

</xml_diff>